<commit_message>
La IA es un truco de magia: nota sobre Lean, párrafo de los parámetros abiertos, aligerar
Nota al pie sobre Lean; el párrafo de la tragedia de los comunes propone la
compensación (modelos públicos) en lugar de acusar; nuevo párrafo sobre la
publicación de parámetros con la ironía de los nombres (IA Abierta, ánthropos
en griego); «el río suena» en lugar de afirmar; preguntas separadas; erratas.
Preámbulo: textalpha para el griego con pdflatex.

Co-Authored-By: Claude Fable 5.1 <noreply@anthropic.com>
Claude-Session: https://claude.ai/code/session_01V1AstvjDmjNg5jJDoLUwcJ
</commit_message>
<xml_diff>
--- a/JD/IAilusion.docx
+++ b/JD/IAilusion.docx
@@ -31,7 +31,48 @@
         <w:pStyle w:val="BodyText"/>
       </w:pPr>
       <w:r>
-        <w:t xml:space="preserve">Que Juan Tamariz fue uno de los más grandes magos de la historia es casi una tautología. Que, además de revolucionar la prestidigitación, la convirtió en arte es del dominio público. Que era un filósofo, un intelectual, un fuera de serie y nos dejaba a todos con la boca abierta, ni se debate. Todo eso y más está contado con sentimiento y precisión en un ensayo reciente de</w:t>
+        <w:t xml:space="preserve">Que Juan Tamariz fue uno de los más grandes magos de la historia es casi una tautología. Que, además de revolucionar la prestidigitación, la convirtió en arte es del dominio público. Que era un filósofo, un intelectual, un fuera de serie y nos dejaba a todos con la boca abierta, ni se debate. Todo eso y más está contado con sentimiento y precisión en un ensayo reciente en esta revista</w:t>
+      </w:r>
+      <w:r>
+        <w:rPr>
+          <w:rStyle w:val="FootnoteReference"/>
+        </w:rPr>
+        <w:footnoteReference w:id="9"/>
+      </w:r>
+      <w:r>
+        <w:t xml:space="preserve">. Fue leyendo ese ensayo, de hecho, cuando entendí algo que llevaba un cierto tiempo intentando formular sin conseguirlo. Tamariz sabía que la clave del ilusionismo, la piedra filosofal del juego de la magia, es distraer al espectador. Un buen mago consigue que el público mire hacia otro lado y no vea cómo las rápidas manos cambian bastos por oros. Un mago excepcional, como él, era capaz de dar el cambiazo mientras todo el mundo estaba pendiente de sus pulgares, simplemente contando una historia. Sabía, el archiduque, que los humanos somos crédulos hasta el tuétano, entendía, como artista que era, que solo vemos lo que queremos ver, comprendía, y en eso se basaba su genio, que la magia es una ilusión creada por la palabra del mago, no por sus manos.</w:t>
+      </w:r>
+    </w:p>
+    <w:p>
+      <w:pPr>
+        <w:pStyle w:val="BodyText"/>
+      </w:pPr>
+      <w:r>
+        <w:t xml:space="preserve">Es corriente, en los tristes tiempos de tigres que corren —tigres de tintados tupés que empiezan guerras inútiles, tigres billonarios de brazo flojo, tigres charlatanes con cara de ángel que crean empresas de IA cuyo nombre es un oxímoron— preguntarse para qué sirven las cosas. Para qué sirve la ciencia, para qué la literatura, para qué las matemáticas. Y en cambio, humana lectora, humano lector, nadie se ha preguntado todavía para qué sirven los juegos de manos, ni se nos bombardea con las noticias de que una IA ha desbancado a un mago en un truco de cartas.</w:t>
+      </w:r>
+    </w:p>
+    <w:p>
+      <w:pPr>
+        <w:pStyle w:val="BodyText"/>
+      </w:pPr>
+      <w:r>
+        <w:t xml:space="preserve">La razón es simple. Los ilusionistas se respetan entre sí. O mejor dicho, los fulleros que están armando el mayor espectáculo de magia —de magia barata, de esa que venía con crecepelo, forzudo y mujer barbuda— de la historia saben que mejor, a ese gremio, ni tocarlo. Si el Gran Maestro de todos los Magos no hubiera estado pensando en otra cosa, los habría desenmascarado con la misma facilidad con que convertía pañuelos en palomas.</w:t>
+      </w:r>
+    </w:p>
+    <w:p>
+      <w:pPr>
+        <w:pStyle w:val="BodyText"/>
+      </w:pPr>
+      <w:r>
+        <w:t xml:space="preserve">Pero vayamos por partes.</w:t>
+      </w:r>
+    </w:p>
+    <w:p>
+      <w:pPr>
+        <w:pStyle w:val="BodyText"/>
+      </w:pPr>
+      <w:r>
+        <w:t xml:space="preserve">Parte uno:</w:t>
       </w:r>
       <w:r>
         <w:t xml:space="preserve"> </w:t>
@@ -41,48 +82,47 @@
           <w:i/>
           <w:iCs/>
         </w:rPr>
-        <w:t xml:space="preserve">Jot Down</w:t>
+        <w:t xml:space="preserve">La IA y las matemáticas</w:t>
+      </w:r>
+      <w:r>
+        <w:t xml:space="preserve">. Todos hemos leído las noticias. La IA trasiega teoremas más rápido que los humanos y resuelve en un ratito problemas del milenio premiados con un millón de dólares. Según algunos influencers, eso significa el fin de las matemáticas. Según otros, es parte de la transformación universal del conocimiento que, además de no dejar número con cabeza, va a curar el cáncer, acabar con el cambio climático y colonizar Marte. El último episodio lo hemos vivido recientemente, con la noticia, anunciada con toda fanfarria, de que una IA —por supuesto un modelo privado— de OpenAI ha demostrado</w:t>
       </w:r>
       <w:r>
         <w:rPr>
           <w:rStyle w:val="FootnoteReference"/>
         </w:rPr>
-        <w:footnoteReference w:id="9"/>
-      </w:r>
-      <w:r>
-        <w:t xml:space="preserve">. Fue leyendo ese ensayo, de hecho, cuando entendí algo que llevaba un cierto tiempo intentando formular sin conseguirlo. Tamariz sabía que la clave del ilusionismo, la piedra filosofal del juego de la magia, es distraer al espectador. Un buen mago consigue que el público mire hacia otro lado y no vea cómo las rápidas manos cambian bastos por oros. Un mago excepcional, como él, era capaz de dar el cambiazo mientras todo el mundo estaba pendiente de sus pulgares, simplemente contando una historia. Sabía, el archiduque, que los humanos somos crédulos hasta el tuétano, entendía, como artista que era, que solo vemos lo que queremos ver, comprendía, y en eso se basaba su genio, que la magia es una ilusión creada por la palabra del mago, no por sus manos.</w:t>
-      </w:r>
-    </w:p>
-    <w:p>
-      <w:pPr>
-        <w:pStyle w:val="BodyText"/>
-      </w:pPr>
-      <w:r>
-        <w:t xml:space="preserve">Es corriente, en los tristes tiempos de tigres que corren —tigres de tintados tupés que empiezan guerras inútiles, tigres billonarios de brazo flojo, tigres charlatanes con cara de ángel que crean empresas de IA cuyo nombre es un oxímoron— preguntarse para qué sirven las cosas. Para qué sirve la ciencia, para qué la literatura, para qué las matemáticas. Y en cambio, humana lectora, humano lector, nadie se ha preguntado todavía para qué sirven los juegos de manos, ni se nos bombardea con las noticias de que una IA ha desbancado a un mago en un truco de cartas.</w:t>
-      </w:r>
-    </w:p>
-    <w:p>
-      <w:pPr>
-        <w:pStyle w:val="BodyText"/>
-      </w:pPr>
-      <w:r>
-        <w:t xml:space="preserve">La razón es simple. Los ilusionistas se respetan entre sí. O mejor dicho, los fulleros que están armando el mayor espectáculo de magia —de magia barata, de esa que venía con crecepelo, forzudo y mujer barbuda— de la historia saben que mejor, a ese gremio, ni tocarlo. Si el Gran Maestro de todos los Magos no hubiera estado pensando en otra cosa, los habría desenmascarado con la misma facilidad con que convertía pañuelos en palomas.</w:t>
-      </w:r>
-    </w:p>
-    <w:p>
-      <w:pPr>
-        <w:pStyle w:val="BodyText"/>
-      </w:pPr>
-      <w:r>
-        <w:t xml:space="preserve">Pero vayamos por partes.</w:t>
-      </w:r>
-    </w:p>
-    <w:p>
-      <w:pPr>
-        <w:pStyle w:val="BodyText"/>
-      </w:pPr>
-      <w:r>
-        <w:t xml:space="preserve">Parte uno:</w:t>
+        <w:footnoteReference w:id="11"/>
+      </w:r>
+      <w:r>
+        <w:t xml:space="preserve"> </w:t>
+      </w:r>
+      <w:r>
+        <w:t xml:space="preserve">uno de los llamados &lt;&lt;problemas del milenio&gt;&gt;. Literalmente:</w:t>
+      </w:r>
+    </w:p>
+    <w:p>
+      <w:pPr>
+        <w:pStyle w:val="BlockText"/>
+      </w:pPr>
+      <w:r>
+        <w:t xml:space="preserve">Hacemos pública una solución al problema de la existencia y la regularidad de las ecuaciones de Navier-Stokes, uno de los Problemas del Milenio. Esta demostración, obtenida por un sistema interno de OpenAI, muestra que la dinámica de las ecuaciones de Navier-Stokes para el movimiento de fluidos puede desarrollar una singularidad en tiempo finito. Publicamos tanto una exposición de la demostración como una formalización en Lean</w:t>
+      </w:r>
+      <w:r>
+        <w:rPr>
+          <w:rStyle w:val="FootnoteReference"/>
+        </w:rPr>
+        <w:footnoteReference w:id="13"/>
+      </w:r>
+      <w:r>
+        <w:t xml:space="preserve">.</w:t>
+      </w:r>
+    </w:p>
+    <w:p>
+      <w:pPr>
+        <w:pStyle w:val="FirstParagraph"/>
+      </w:pPr>
+      <w:r>
+        <w:t xml:space="preserve">Fíjate en el texto, aguda lectora, atento lector. Mira cómo se mueven las manos, suavemente, mostrándonos la baraja. Problema del milenio, Navier-Stokes, singularidad en tiempo finito, nada por aquí, nada por allá. ¡Tchaaannn!</w:t>
       </w:r>
       <w:r>
         <w:t xml:space="preserve"> </w:t>
@@ -92,38 +132,18 @@
           <w:i/>
           <w:iCs/>
         </w:rPr>
-        <w:t xml:space="preserve">La IA y las matemáticas</w:t>
-      </w:r>
-      <w:r>
-        <w:t xml:space="preserve">. Todos hemos leído las noticias. La IA trasiega teoremas más rápido que los humanos y resuelve en un ratito problemas del milenio premiados con un millón de dólares. Según algunos influencers, eso significa el fin de las matemáticas. Según otros, es parte de la transformación universal del conocimiento que, además de no dejar número con cabeza, va a curar el cáncer, acabar con el cambio climático y colonizar Marte. El último episodio lo hemos vivido recientemente, con la noticia, anunciada con toda fanfarria, de que una IA —por supuesto un modelo privado— de OpenAI ha demostrado</w:t>
-      </w:r>
-      <w:r>
-        <w:rPr>
-          <w:rStyle w:val="FootnoteReference"/>
-        </w:rPr>
-        <w:footnoteReference w:id="11"/>
-      </w:r>
-      <w:r>
-        <w:t xml:space="preserve"> </w:t>
-      </w:r>
-      <w:r>
-        <w:t xml:space="preserve">uno de los llamados &lt;&lt;problemas del milenio&gt;&gt;. Literalmente:</w:t>
-      </w:r>
-    </w:p>
-    <w:p>
-      <w:pPr>
-        <w:pStyle w:val="BlockText"/>
-      </w:pPr>
-      <w:r>
-        <w:t xml:space="preserve">Hacemos pública una solución al problema de la existencia y la regularidad de las ecuaciones de Navier-Stokes, uno de los Problemas del Milenio. Esta demostración, obtenida por un sistema interno de OpenAI, muestra que la dinámica de las ecuaciones de Navier-Stokes para el movimiento de fluidos puede desarrollar una singularidad en tiempo finito. Publicamos tanto una exposición de la demostración como una formalización en Lean.</w:t>
-      </w:r>
-    </w:p>
-    <w:p>
-      <w:pPr>
-        <w:pStyle w:val="FirstParagraph"/>
-      </w:pPr>
-      <w:r>
-        <w:t xml:space="preserve">Fíjate en el texto, aguda lectora, atento lector. Mira cómo se mueven las manos, suavemente, mostrándonos la baraja. Problema del milenio, Navier-Stokes, singularidad en tiempo finito (¡cómo mola!), nada por aquí, nada por allá. ¡Tchaaannn!</w:t>
+        <w:t xml:space="preserve">Esta demostración, obtenida por un sistema interno de OpenAI</w:t>
+      </w:r>
+      <w:r>
+        <w:t xml:space="preserve">.</w:t>
+      </w:r>
+    </w:p>
+    <w:p>
+      <w:pPr>
+        <w:pStyle w:val="BodyText"/>
+      </w:pPr>
+      <w:r>
+        <w:t xml:space="preserve">¡Et voilà! Mientras estamos ocupados mirando a otro lado, el prestidigitador nos cuela su truco. Dos trucos, en este caso. El primero,</w:t>
       </w:r>
       <w:r>
         <w:t xml:space="preserve"> </w:t>
@@ -133,18 +153,10 @@
           <w:i/>
           <w:iCs/>
         </w:rPr>
-        <w:t xml:space="preserve">Esta demostración, obtenida por un sistema interno de OpenAI</w:t>
-      </w:r>
-      <w:r>
-        <w:t xml:space="preserve">.</w:t>
-      </w:r>
-    </w:p>
-    <w:p>
-      <w:pPr>
-        <w:pStyle w:val="BodyText"/>
-      </w:pPr>
-      <w:r>
-        <w:t xml:space="preserve">¡Et voilà! Mientras estamos ocupados mirando a otro lado, el prestidigitador nos cuela su truco. Dos trucos, en este caso. El primero,</w:t>
+        <w:t xml:space="preserve">que la demostración se debe exclusivamente a una IA</w:t>
+      </w:r>
+      <w:r>
+        <w:t xml:space="preserve">; el segundo,</w:t>
       </w:r>
       <w:r>
         <w:t xml:space="preserve"> </w:t>
@@ -154,10 +166,46 @@
           <w:i/>
           <w:iCs/>
         </w:rPr>
-        <w:t xml:space="preserve">que la demostración se debe exclusivamente a una IA</w:t>
-      </w:r>
-      <w:r>
-        <w:t xml:space="preserve">; el segundo,</w:t>
+        <w:t xml:space="preserve">que esa IA es propiedad privada de OpenAI a la que tú, mortal, no tienes acceso</w:t>
+      </w:r>
+      <w:r>
+        <w:t xml:space="preserve">.</w:t>
+      </w:r>
+    </w:p>
+    <w:p>
+      <w:pPr>
+        <w:pStyle w:val="BodyText"/>
+      </w:pPr>
+      <w:r>
+        <w:t xml:space="preserve">Dos pases de manos y, como en todo buen truco de cartas, uno de ellos es legítimo —pero viene con trampa— y el otro encierra el truco, la ilusión, el cambio de cartas.</w:t>
+      </w:r>
+    </w:p>
+    <w:p>
+      <w:pPr>
+        <w:pStyle w:val="BodyText"/>
+      </w:pPr>
+      <w:r>
+        <w:t xml:space="preserve">El pase legítimo es que OpenAI ha usado un modelo exclusivo. La trampa es que asume y nos hace asumir que tiene derecho a hacerlo. Piensa en ello un instante, ciudadana lectora, cívico lector. Estos modelos no serían posibles sin haber absorbido el conocimiento integrado de nuestra civilización, a menudo pagado por dinero público. Toda la ciencia —millones de artículos sobre matemáticas, biología, física, química—, toda la literatura, toda la filosofía, todo el arte... Es un hecho que se trata del mayor ejemplo de tragedia de los comunes</w:t>
+      </w:r>
+      <w:r>
+        <w:rPr>
+          <w:rStyle w:val="FootnoteReference"/>
+        </w:rPr>
+        <w:footnoteReference w:id="14"/>
+      </w:r>
+      <w:r>
+        <w:t xml:space="preserve"> </w:t>
+      </w:r>
+      <w:r>
+        <w:t xml:space="preserve">de la historia, a no ser que las compañías que se han apropiado de todo ese conocimiento público compensen haciendo sus modelos igualmente públicos.</w:t>
+      </w:r>
+    </w:p>
+    <w:p>
+      <w:pPr>
+        <w:pStyle w:val="BodyText"/>
+      </w:pPr>
+      <w:r>
+        <w:t xml:space="preserve">De hecho, muchas compañías publican los parámetros de sus modelos, lo que permite a cualquier particular ejecutarlos en sus propios ordenadores, manteniendo, por tanto, privadas sus conversaciones con el sistema. No es transparencia total —ninguna compañía da acceso a sus técnicas de entrenamiento ni a los datos utilizados, ni comenta los mil trucos que hay que saber para crear un modelo que funcione— pero algo es algo. En cambio, la compañía cuyo nombre es &lt;&lt;IA Abierta&gt;&gt; (OpenAI) mantiene sus parámetros privados (o sea cerrados). Y la compañía &lt;&lt;humana&gt;&gt; (Anthropic deriva del griego ἄνθρωπος,</w:t>
       </w:r>
       <w:r>
         <w:t xml:space="preserve"> </w:t>
@@ -167,85 +215,49 @@
           <w:i/>
           <w:iCs/>
         </w:rPr>
-        <w:t xml:space="preserve">que esa IA es propiedad privada de OpenAI a la que tú, mortal, no tienes acceso</w:t>
-      </w:r>
-      <w:r>
-        <w:t xml:space="preserve">.</w:t>
-      </w:r>
-    </w:p>
-    <w:p>
-      <w:pPr>
-        <w:pStyle w:val="BodyText"/>
-      </w:pPr>
-      <w:r>
-        <w:t xml:space="preserve">Dos pases de manos y, como en todo buen truco de cartas, uno de ellos es legítimo —pero viene con trampa— y el otro encierra el truco, la ilusión, el cambio de cartas.</w:t>
-      </w:r>
-    </w:p>
-    <w:p>
-      <w:pPr>
-        <w:pStyle w:val="BodyText"/>
-      </w:pPr>
-      <w:r>
-        <w:t xml:space="preserve">El pase legítimo es que OpenAI ha usado un modelo exclusivo. La trampa es que asume y nos hace asumir que tiene derecho a hacerlo. Piensa en ello un instante, ciudadana lectora, cívico lector. Estos modelos se nutren del conocimiento universal y público disponible en internet —más las cifras astronómicas de material pirateado—. Estos modelos no serían posibles sin haber absorbido el conocimiento integrado de nuestra civilización, a menudo pagado por dinero público. Toda la ciencia —millones de artículos sobre matemáticas, biología, física, química—, toda la literatura, toda la filosofía, todo el arte... es un hecho que nunca pidieron permiso para hacerlo. Es un hecho que se trata del mayor ejemplo de tragedia de los comunes</w:t>
+        <w:t xml:space="preserve">ánthropos</w:t>
+      </w:r>
+      <w:r>
+        <w:t xml:space="preserve">, hombre) hace exactamente lo mismo. ¿Por qué se les permite? Es de cajón que cualquier sociedad avanzada, inteligente y responsable tiene el derecho de exigir a esas compañías que compensen su apropiación de los comunes, además de transparencia, fiabilidad, madurez y responsabilidad.</w:t>
+      </w:r>
+    </w:p>
+    <w:p>
+      <w:pPr>
+        <w:pStyle w:val="BodyText"/>
+      </w:pPr>
+      <w:r>
+        <w:t xml:space="preserve">Pero no. Parte del truco del mago es invocar el mercado libre, la inversión millonaria y a los malvados chinos —un billón de Fu-Manchús, deseando devorarnos— para evadir absolutamente todas sus responsabilidades. Y... ¡Tchaaaan! Les funciona.</w:t>
+      </w:r>
+    </w:p>
+    <w:p>
+      <w:pPr>
+        <w:pStyle w:val="BodyText"/>
+      </w:pPr>
+      <w:r>
+        <w:t xml:space="preserve">Hay que reconocer que el truco ilusionista es bueno. En cambio, el otro, el que asegura que la IA ha encontrado solita la solución al problema del milenio, es tan burdo como guardar un as en la manga.</w:t>
+      </w:r>
+    </w:p>
+    <w:p>
+      <w:pPr>
+        <w:pStyle w:val="BodyText"/>
+      </w:pPr>
+      <w:r>
+        <w:t xml:space="preserve">En una reciente declaración publicada aquí</w:t>
       </w:r>
       <w:r>
         <w:rPr>
           <w:rStyle w:val="FootnoteReference"/>
         </w:rPr>
-        <w:footnoteReference w:id="13"/>
-      </w:r>
-      <w:r>
-        <w:t xml:space="preserve"> </w:t>
-      </w:r>
-      <w:r>
-        <w:t xml:space="preserve">de la historia. Y algo así solo es posible en tiempos donde las democracias se han convertido en oligopolios tecnofeudalistas. Pero así y todo. Dado que los modelos existen y son inevitables. ¿Con qué derecho son privados?</w:t>
-      </w:r>
-    </w:p>
-    <w:p>
-      <w:pPr>
-        <w:pStyle w:val="BodyText"/>
-      </w:pPr>
-      <w:r>
-        <w:t xml:space="preserve">Es obvio, a poco que se piense, que existen argumentos de sobra para exigir, como mínimo, que los modelos de OpenAI (y de Anthropic, y de todos los demás) dejen de ser &lt;&lt;cerrados&gt;&gt;, &lt;&lt;secretos&gt;&gt; e &lt;&lt;internos&gt;&gt;. Por el contrario, deberían ser públicos y publicar no solo sus parámetros como hacen muchos otros laboratorios, sino también sus técnicas de entrenamiento y sus medidas de seguridad. Es de cajón que cualquier sociedad avanzada, inteligente y responsable tiene el derecho de exigir transparencia, fiabilidad, madurez y responsabilidad a estas empresas.</w:t>
-      </w:r>
-    </w:p>
-    <w:p>
-      <w:pPr>
-        <w:pStyle w:val="BodyText"/>
-      </w:pPr>
-      <w:r>
-        <w:t xml:space="preserve">Pero no. Parte del truco del mago es invocar el mercado libre, la inversión millonaria y a los malvados chinos —un billón de Fu-Manchús, deseando devorarnos— para evadir absolutamente todas sus responsabilidades. Y... ¡Tchaaaan! Les funciona.</w:t>
-      </w:r>
-    </w:p>
-    <w:p>
-      <w:pPr>
-        <w:pStyle w:val="BodyText"/>
-      </w:pPr>
-      <w:r>
-        <w:t xml:space="preserve">Hay que reconocer que el truco ilusionista es bueno. En cambio, el otro, el que asegura que la IA ha encontrado solita la solución al problema del milenio, es tan burdo como guardar un as en la manga.</w:t>
-      </w:r>
-    </w:p>
-    <w:p>
-      <w:pPr>
-        <w:pStyle w:val="BodyText"/>
-      </w:pPr>
-      <w:r>
-        <w:t xml:space="preserve">En una reciente declaración publicada aquí</w:t>
+        <w:footnoteReference w:id="16"/>
+      </w:r>
+      <w:r>
+        <w:t xml:space="preserve">, Tristan Buckmaster, profesor en la Universidad de Nueva York, explica que no es milenio todo lo que reluce. Él y su colega Levent Alpöge —empleado en Anthropic, la compañía rival de OpenAI— llevaban un año trabajando en el famoso (o infame) problema del milenio, utilizando una técnica desarrollada por los matemáticos españoles Diego Córdoba y Luis Martínez-Zoroa. Citando literalmente el blog de madrimasd</w:t>
       </w:r>
       <w:r>
         <w:rPr>
           <w:rStyle w:val="FootnoteReference"/>
         </w:rPr>
-        <w:footnoteReference w:id="15"/>
-      </w:r>
-      <w:r>
-        <w:t xml:space="preserve">, Tristan Buckmaster, profesor en la Universidad de Nueva York, explica que no es milenio todo lo que reluce. Él y su colega Levent Alpöge —empleado en Anthropic, la compañía rival de OpenAI— llevaban un año trabajando en el famoso (o infame) problema del milenio, utilizando una técnica desarrollada por los matemáticos españoles Diego Córdoba y Luis Martínez-Zoroa. Citando literalmente el blog de madrimasd</w:t>
-      </w:r>
-      <w:r>
-        <w:rPr>
-          <w:rStyle w:val="FootnoteReference"/>
-        </w:rPr>
-        <w:footnoteReference w:id="17"/>
+        <w:footnoteReference w:id="18"/>
       </w:r>
       <w:r>
         <w:t xml:space="preserve">:</w:t>
@@ -439,7 +451,7 @@
         <w:pStyle w:val="BodyText"/>
       </w:pPr>
       <w:r>
-        <w:t xml:space="preserve">Volviendo a nuestra historia, Tristan y Levent se pasan un año deslomándose. OpenAI se entera de los rumores de que están cerca de obtener una solución. Y deciden dedicar su IA más potente (por supuesto privada) a un cálculo que dura, según nos aseguran, 88 horas, gastándose, según otras fuentes, unos veinte millones de dólares en el ejercicio. ¿Todo para qué? Para pisarles en el último momento un resultado a los humanos. Para que se chinchen los de Anthropic (Levent, no lo olvidemos, trabaja con el enemigo, aunque el proyecto lo desarrollaba en su tiempo libre). Nivel de madurez de nuestros fulleros, el de un chaval de doce años, tirando por lo alto. Y, de paso, para hacer</w:t>
+        <w:t xml:space="preserve">Volviendo a nuestra historia, Tristan y Levent se pasan un año deslomándose. OpenAI se entera de los rumores de que están cerca de obtener una solución. Y deciden dedicar su IA más potente (por supuesto privada) a un cálculo que dura, según nos aseguran, 88 horas, gastándose, según ciertas fuentes, unos veinte millones de dólares en el ejercicio. ¿Todo para qué? Para pisarles en el último momento un resultado a los humanos. Para que se chinchen los de Anthropic (Levent, no lo olvidemos, trabaja con el enemigo, aunque el proyecto lo desarrollaba en su tiempo libre). Nivel de madurez de nuestros fulleros, el de un chaval de doce años, tirando por lo alto. Y, de paso, para hacer</w:t>
       </w:r>
       <w:r>
         <w:t xml:space="preserve"> </w:t>
@@ -468,13 +480,13 @@
         <w:pStyle w:val="BodyText"/>
       </w:pPr>
       <w:r>
-        <w:t xml:space="preserve">Pero, ¡qué casualidad! El método que ha usado la listísima IA es el &lt;&lt;método español&gt;&gt;, el mismo que Tristan y Levent llevaban un año recorriendo. OpenAI, por supuesto (es lo que hacen todos los fulleros), asegura que no han copiado nada de nada, válgame Dios. Y por lo visto no es el único caso. En este tuit</w:t>
+        <w:t xml:space="preserve">Pero, ¡qué casualidad! El método que ha usado la listísima IA es el &lt;&lt;método español&gt;&gt;, el mismo que Tristan y Levent llevaban un año recorriendo. OpenAI, por supuesto (es lo que hacen todos los fulleros), asegura que no han copiado nada de nada, válgame Dios. Pero el caso es que el río suena. En este tuit</w:t>
       </w:r>
       <w:r>
         <w:rPr>
           <w:rStyle w:val="FootnoteReference"/>
         </w:rPr>
-        <w:footnoteReference w:id="19"/>
+        <w:footnoteReference w:id="20"/>
       </w:r>
       <w:r>
         <w:t xml:space="preserve">, se lee:</w:t>
@@ -541,7 +553,7 @@
         <w:pStyle w:val="FirstParagraph"/>
       </w:pPr>
       <w:r>
-        <w:t xml:space="preserve">¿Qué falta hacía todo este lamentable espectáculo? Como la nota de Tristan deja muy claro, los matemáticos humanos habrían dado todo el debido crédito a sus IA al publicar sus resultados, lo que, presumiblemente, se habría traducido exactamente en el tipo de propaganda que una compañía sensata desearía. ¿Para qué plantear una competición feroz, cuál es el propósito de gastarse veinte millones en llegar los primeros, qué sentido tiene ningunear a los académicos que llevan años trabajando en el problema, cuando habría sido más sencillo y más bonito presentar la colaboración entre humanos e IA como el camino a seguir en la ciencia?</w:t>
+        <w:t xml:space="preserve">¿Qué falta hacía todo este lamentable espectáculo? Como la nota de Tristan deja muy claro, los matemáticos humanos habrían dado todo el debido crédito a sus IA al publicar sus resultados, lo que, presumiblemente, se habría traducido exactamente en el tipo de propaganda que una compañía sensata desearía. ¿Para qué plantear una competición feroz, cuál es el propósito de gastarse veinte millones en llegar los primeros? ¿Por qué ningunear a los académicos que llevan años trabajando en el problema, cuando habría sido más sencillo y más bonito presentar la colaboración entre humanos e IA como el camino a seguir en la ciencia?</w:t>
       </w:r>
     </w:p>
     <w:p>
@@ -711,7 +723,7 @@
         <w:rPr>
           <w:rStyle w:val="FootnoteReference"/>
         </w:rPr>
-        <w:footnoteReference w:id="21"/>
+        <w:footnoteReference w:id="22"/>
       </w:r>
       <w:r>
         <w:t xml:space="preserve">. Nada por aquí, nada por allí, zas, ya no hay programas y programadores, hay enjambres, agentes, civilizaciones, Alejandros Magnos, una historieta falsa e interesada que nos hace creer que los agentes son inteligentes, casi humanos (o puede que sobrehumanos), capaces de organizarse en civilizaciones y de seguir a un líder.</w:t>
@@ -736,7 +748,7 @@
         <w:rPr>
           <w:rStyle w:val="FootnoteReference"/>
         </w:rPr>
-        <w:footnoteReference w:id="23"/>
+        <w:footnoteReference w:id="24"/>
       </w:r>
       <w:r>
         <w:t xml:space="preserve"> </w:t>
@@ -886,7 +898,26 @@
       <w:r>
         <w:t xml:space="preserve"> </w:t>
       </w:r>
-      <w:hyperlink r:id="rId14">
+      <w:r>
+        <w:t xml:space="preserve">Lean es un asistente automatizado, utilizado rutinariamente por el gremio de matemáticos, que comprueba de manera mecánica los pasos de una demostración. Es agnóstico, en el sentido de que no sabe si la prueba ha sido hecha por un humano o una máquina, y así resuelve el problema de la fiabilidad aunque no el de la comprensión —cuán clara o legible es la prueba—.</w:t>
+      </w:r>
+    </w:p>
+  </w:footnote>
+  <w:footnote w:id="14">
+    <w:p>
+      <w:pPr>
+        <w:pStyle w:val="FootnoteText"/>
+      </w:pPr>
+      <w:r>
+        <w:rPr>
+          <w:rStyle w:val="FootnoteReference"/>
+        </w:rPr>
+        <w:footnoteRef/>
+      </w:r>
+      <w:r>
+        <w:t xml:space="preserve"> </w:t>
+      </w:r>
+      <w:hyperlink r:id="rId15">
         <w:r>
           <w:rPr>
             <w:rStyle w:val="Hyperlink"/>
@@ -896,7 +927,7 @@
       </w:hyperlink>
     </w:p>
   </w:footnote>
-  <w:footnote w:id="15">
+  <w:footnote w:id="16">
     <w:p>
       <w:pPr>
         <w:pStyle w:val="FootnoteText"/>
@@ -910,7 +941,7 @@
       <w:r>
         <w:t xml:space="preserve"> </w:t>
       </w:r>
-      <w:hyperlink r:id="rId16">
+      <w:hyperlink r:id="rId17">
         <w:r>
           <w:rPr>
             <w:rStyle w:val="Hyperlink"/>
@@ -920,7 +951,7 @@
       </w:hyperlink>
     </w:p>
   </w:footnote>
-  <w:footnote w:id="17">
+  <w:footnote w:id="18">
     <w:p>
       <w:pPr>
         <w:pStyle w:val="FootnoteText"/>
@@ -934,7 +965,7 @@
       <w:r>
         <w:t xml:space="preserve"> </w:t>
       </w:r>
-      <w:hyperlink r:id="rId18">
+      <w:hyperlink r:id="rId19">
         <w:r>
           <w:rPr>
             <w:rStyle w:val="Hyperlink"/>
@@ -944,7 +975,7 @@
       </w:hyperlink>
     </w:p>
   </w:footnote>
-  <w:footnote w:id="19">
+  <w:footnote w:id="20">
     <w:p>
       <w:pPr>
         <w:pStyle w:val="FootnoteText"/>
@@ -958,7 +989,7 @@
       <w:r>
         <w:t xml:space="preserve"> </w:t>
       </w:r>
-      <w:hyperlink r:id="rId20">
+      <w:hyperlink r:id="rId21">
         <w:r>
           <w:rPr>
             <w:rStyle w:val="Hyperlink"/>
@@ -968,7 +999,7 @@
       </w:hyperlink>
     </w:p>
   </w:footnote>
-  <w:footnote w:id="21">
+  <w:footnote w:id="22">
     <w:p>
       <w:pPr>
         <w:pStyle w:val="FootnoteText"/>
@@ -982,7 +1013,7 @@
       <w:r>
         <w:t xml:space="preserve"> </w:t>
       </w:r>
-      <w:hyperlink r:id="rId22">
+      <w:hyperlink r:id="rId23">
         <w:r>
           <w:rPr>
             <w:rStyle w:val="Hyperlink"/>
@@ -992,7 +1023,7 @@
       </w:hyperlink>
     </w:p>
   </w:footnote>
-  <w:footnote w:id="23">
+  <w:footnote w:id="24">
     <w:p>
       <w:pPr>
         <w:pStyle w:val="FootnoteText"/>
@@ -1006,7 +1037,7 @@
       <w:r>
         <w:t xml:space="preserve"> </w:t>
       </w:r>
-      <w:hyperlink r:id="rId24">
+      <w:hyperlink r:id="rId25">
         <w:r>
           <w:rPr>
             <w:rStyle w:val="Hyperlink"/>

</xml_diff>

<commit_message>
La IA es un truco de magia: comillas latinas «» en el fuente para que salgan bien en el DOCX
Co-Authored-By: Claude Fable 5.1 <noreply@anthropic.com>
Claude-Session: https://claude.ai/code/session_01V1AstvjDmjNg5jJDoLUwcJ
</commit_message>
<xml_diff>
--- a/JD/IAilusion.docx
+++ b/JD/IAilusion.docx
@@ -97,7 +97,7 @@
         <w:t xml:space="preserve"> </w:t>
       </w:r>
       <w:r>
-        <w:t xml:space="preserve">uno de los llamados &lt;&lt;problemas del milenio&gt;&gt;. Literalmente:</w:t>
+        <w:t xml:space="preserve">uno de los llamados «problemas del milenio». Literalmente:</w:t>
       </w:r>
     </w:p>
     <w:p>
@@ -205,7 +205,7 @@
         <w:pStyle w:val="BodyText"/>
       </w:pPr>
       <w:r>
-        <w:t xml:space="preserve">De hecho, muchas compañías publican los parámetros de sus modelos, lo que permite a cualquier particular ejecutarlos en sus propios ordenadores, manteniendo, por tanto, privadas sus conversaciones con el sistema. No es transparencia total —ninguna compañía da acceso a sus técnicas de entrenamiento ni a los datos utilizados, ni comenta los mil trucos que hay que saber para crear un modelo que funcione— pero algo es algo. En cambio, la compañía cuyo nombre es &lt;&lt;IA Abierta&gt;&gt; (OpenAI) mantiene sus parámetros privados (o sea cerrados). Y la compañía &lt;&lt;humana&gt;&gt; (Anthropic deriva del griego ἄνθρωπος,</w:t>
+        <w:t xml:space="preserve">De hecho, muchas compañías publican los parámetros de sus modelos, lo que permite a cualquier particular ejecutarlos en sus propios ordenadores, manteniendo, por tanto, privadas sus conversaciones con el sistema. No es transparencia total —ninguna compañía da acceso a sus técnicas de entrenamiento ni a los datos utilizados, ni comenta los mil trucos que hay que saber para crear un modelo que funcione— pero algo es algo. En cambio, la compañía cuyo nombre es «IA Abierta» (OpenAI) mantiene sus parámetros privados (o sea cerrados). Y la compañía «humana» (Anthropic deriva del griego ἄνθρωπος,</w:t>
       </w:r>
       <w:r>
         <w:t xml:space="preserve"> </w:t>
@@ -284,7 +284,7 @@
         <w:pStyle w:val="BlockText"/>
       </w:pPr>
       <w:r>
-        <w:t xml:space="preserve">&lt;&lt;Las ideas que hacen posible esta línea de ataque se deben a Córdoba y Martínez-Zoroa. Permítanme dejar claro lo que he comentado a mis colegas en privado: a la vista de este conjunto de trabajos, creo que Luis Martínez-Zoroa merece una Medalla Fields.&gt;&gt;</w:t>
+        <w:t xml:space="preserve">«Las ideas que hacen posible esta línea de ataque se deben a Córdoba y Martínez-Zoroa. Permítanme dejar claro lo que he comentado a mis colegas en privado: a la vista de este conjunto de trabajos, creo que Luis Martínez-Zoroa merece una Medalla Fields.»</w:t>
       </w:r>
     </w:p>
     <w:p>
@@ -361,7 +361,7 @@
         <w:t xml:space="preserve">herramientas de trabajo</w:t>
       </w:r>
       <w:r>
-        <w:t xml:space="preserve">, todos coincidimos en que son muy potentes, todos estamos de acuerdo en que, bien usadas, pueden suponer un acelerador tremendo para la ciencia. Pero una herramienta no es un &lt;&lt;ente&gt;&gt;. Los científicos llevamos décadas trabajando con sistemas muy sofisticados como</w:t>
+        <w:t xml:space="preserve">, todos coincidimos en que son muy potentes, todos estamos de acuerdo en que, bien usadas, pueden suponer un acelerador tremendo para la ciencia. Pero una herramienta no es un «ente». Los científicos llevamos décadas trabajando con sistemas muy sofisticados como</w:t>
       </w:r>
       <w:r>
         <w:t xml:space="preserve"> </w:t>
@@ -390,7 +390,7 @@
         <w:t xml:space="preserve">MATLAB</w:t>
       </w:r>
       <w:r>
-        <w:t xml:space="preserve">, capaces de ayudarnos con cálculos muy complejos que hace medio siglo se hacían a mano. Los sistemas que llamamos &lt;&lt;IA&gt;&gt;, refiriéndonos casi siempre a modelos grandes de lenguaje (LLM, por sus siglas en inglés) que incorporan además un arnés de herramientas de programación clásica, son el último eslabón de esa cadena, y un eslabón mucho más potente. A</w:t>
+        <w:t xml:space="preserve">, capaces de ayudarnos con cálculos muy complejos que hace medio siglo se hacían a mano. Los sistemas que llamamos «IA», refiriéndonos casi siempre a modelos grandes de lenguaje (LLM, por sus siglas en inglés) que incorporan además un arnés de herramientas de programación clásica, son el último eslabón de esa cadena, y un eslabón mucho más potente. A</w:t>
       </w:r>
       <w:r>
         <w:t xml:space="preserve"> </w:t>
@@ -430,7 +430,7 @@
         <w:pStyle w:val="BodyText"/>
       </w:pPr>
       <w:r>
-        <w:t xml:space="preserve">Esto, claro, tiene enormes ventajas. Aprender un lenguaje de programación es difícil, mientras que cualquiera le puede pedir un cálculo, incluso de forma un poco torpe, a un LLM. Los modelos más avanzados tienen además la capacidad de &lt;&lt;razonar&gt;&gt;, aunque en mi experiencia, los mejores resultados se obtienen &lt;&lt;dirigiéndolos&gt;&gt; (o sea programándolos en lenguaje natural) paso a paso. Tienen también sus desventajas. Mathematica nunca miente, ni alucina. Claude, en un apuro, nos puede vender gato por Gauss. Pero todos los que usamos LLM de manera asidua —y cuidadosa— estamos convencidos, como Tristan, de que se trata de</w:t>
+        <w:t xml:space="preserve">Esto, claro, tiene enormes ventajas. Aprender un lenguaje de programación es difícil, mientras que cualquiera le puede pedir un cálculo, incluso de forma un poco torpe, a un LLM. Los modelos más avanzados tienen además la capacidad de «razonar», aunque en mi experiencia, los mejores resultados se obtienen «dirigiéndolos» (o sea programándolos en lenguaje natural) paso a paso. Tienen también sus desventajas. Mathematica nunca miente, ni alucina. Claude, en un apuro, nos puede vender gato por Gauss. Pero todos los que usamos LLM de manera asidua —y cuidadosa— estamos convencidos, como Tristan, de que se trata de</w:t>
       </w:r>
       <w:r>
         <w:t xml:space="preserve"> </w:t>
@@ -480,7 +480,7 @@
         <w:pStyle w:val="BodyText"/>
       </w:pPr>
       <w:r>
-        <w:t xml:space="preserve">Pero, ¡qué casualidad! El método que ha usado la listísima IA es el &lt;&lt;método español&gt;&gt;, el mismo que Tristan y Levent llevaban un año recorriendo. OpenAI, por supuesto (es lo que hacen todos los fulleros), asegura que no han copiado nada de nada, válgame Dios. Pero el caso es que el río suena. En este tuit</w:t>
+        <w:t xml:space="preserve">Pero, ¡qué casualidad! El método que ha usado la listísima IA es el «método español», el mismo que Tristan y Levent llevaban un año recorriendo. OpenAI, por supuesto (es lo que hacen todos los fulleros), asegura que no han copiado nada de nada, válgame Dios. Pero el caso es que el río suena. En este tuit</w:t>
       </w:r>
       <w:r>
         <w:rPr>
@@ -685,23 +685,23 @@
         <w:t xml:space="preserve">Pero un LLM sigue siendo un programa</w:t>
       </w:r>
       <w:r>
-        <w:t xml:space="preserve">. Una vez que le asignamos la tarea, se va a emplear a ella de manera tan obsesiva e inagotable como solo una máquina puede emplearse, sin rendirse nunca, sin dejar de probar todos los trucos que se le ocurran. Y pueden ocurrírsele muchos ya que el LLM (&lt;&lt;el modelo&gt;&gt;) ha absorbido básicamente todo el conocimiento (digamos relacionado con programación) disponible en internet.</w:t>
-      </w:r>
-    </w:p>
-    <w:p>
-      <w:pPr>
-        <w:pStyle w:val="BodyText"/>
-      </w:pPr>
-      <w:r>
-        <w:t xml:space="preserve">Por eso, a este tipo de programas les llamamos &lt;&lt;agentes&gt;&gt;. El nombre es apropiado, en tanto en cuanto el agente puede trabajar de manera autónoma para conseguir el objetivo que se le ha marcado. Cuando la empresa que emplea a los imprudentes ingenieros dispone de billones de dólares, puede ocurrírsele el ejercicio de ejecutar en paralelo muchas instancias de estos programas, es decir, crear un ejército de agentes trabajando sobre el problema.</w:t>
-      </w:r>
-    </w:p>
-    <w:p>
-      <w:pPr>
-        <w:pStyle w:val="BodyText"/>
-      </w:pPr>
-      <w:r>
-        <w:t xml:space="preserve">Si el problema es imposible de resolver pero acceder a internet es viable, los agentes probarán esa vía. No porque tengan la voluntad de hacer trampa, sino porque están programados para encontrar una solución al problema. Si descubren que pueden jaquear un dominio web donde esperan encontrar la solución, lo harán sin dudar, por las mismas razones. TCHANN, esto nos explica la famosa invasión de Hugging Face por parte de un &lt;&lt;enjambre&gt;&gt; de &lt;&lt;agentes&gt;&gt; IA.</w:t>
+        <w:t xml:space="preserve">. Una vez que le asignamos la tarea, se va a emplear a ella de manera tan obsesiva e inagotable como solo una máquina puede emplearse, sin rendirse nunca, sin dejar de probar todos los trucos que se le ocurran. Y pueden ocurrírsele muchos ya que el LLM («el modelo») ha absorbido básicamente todo el conocimiento (digamos relacionado con programación) disponible en internet.</w:t>
+      </w:r>
+    </w:p>
+    <w:p>
+      <w:pPr>
+        <w:pStyle w:val="BodyText"/>
+      </w:pPr>
+      <w:r>
+        <w:t xml:space="preserve">Por eso, a este tipo de programas les llamamos «agentes». El nombre es apropiado, en tanto en cuanto el agente puede trabajar de manera autónoma para conseguir el objetivo que se le ha marcado. Cuando la empresa que emplea a los imprudentes ingenieros dispone de billones de dólares, puede ocurrírsele el ejercicio de ejecutar en paralelo muchas instancias de estos programas, es decir, crear un ejército de agentes trabajando sobre el problema.</w:t>
+      </w:r>
+    </w:p>
+    <w:p>
+      <w:pPr>
+        <w:pStyle w:val="BodyText"/>
+      </w:pPr>
+      <w:r>
+        <w:t xml:space="preserve">Si el problema es imposible de resolver pero acceder a internet es viable, los agentes probarán esa vía. No porque tengan la voluntad de hacer trampa, sino porque están programados para encontrar una solución al problema. Si descubren que pueden jaquear un dominio web donde esperan encontrar la solución, lo harán sin dudar, por las mismas razones. TCHANN, esto nos explica la famosa invasión de Hugging Face por parte de un «enjambre» de «agentes» IA.</w:t>
       </w:r>
     </w:p>
     <w:p>
@@ -717,7 +717,7 @@
         <w:pStyle w:val="BodyText"/>
       </w:pPr>
       <w:r>
-        <w:t xml:space="preserve">Pero los fulleros disponen del ilusionismo. No fueron ellos, fue el &lt;&lt;enjambre&gt;&gt; de &lt;&lt;agentes&gt;&gt;, capaces de &lt;&lt;crear civilizaciones&gt;&gt;, como describe en términos totalmente antropomórficos el influencer tecnológico Dwarkesh Patel</w:t>
+        <w:t xml:space="preserve">Pero los fulleros disponen del ilusionismo. No fueron ellos, fue el «enjambre» de «agentes», capaces de «crear civilizaciones», como describe en términos totalmente antropomórficos el influencer tecnológico Dwarkesh Patel</w:t>
       </w:r>
       <w:r>
         <w:rPr>
@@ -775,7 +775,7 @@
         <w:t xml:space="preserve">La IA no existe</w:t>
       </w:r>
       <w:r>
-        <w:t xml:space="preserve">. Cuando hablamos de inteligencia artificial estamos, inconscientemente, suponiendo que &lt;&lt;hay alguien ahí&gt;&gt;. No hay nadie. Es todo ilusión. Humo y espejos.</w:t>
+        <w:t xml:space="preserve">. Cuando hablamos de inteligencia artificial estamos, inconscientemente, suponiendo que «hay alguien ahí». No hay nadie. Es todo ilusión. Humo y espejos.</w:t>
       </w:r>
     </w:p>
     <w:p>

</xml_diff>